<commit_message>
Update committee guide for confirmed cost target and spreadsheet-only view
- Section 6: replace card/spreadsheet toggle description with spreadsheet
  column reference table (Area, Impl, Cost, Date, Decision, Owner, Flags)
- Section 8: update tip — target date/cost set independently, not on status change
- Section 9: expand to cover both target date and cost target fields,
  document AI estimate vs confirmed (❓/🎯) behaviour for both

Co-Authored-By: Claude Sonnet 4.6 <noreply@anthropic.com>
</commit_message>
<xml_diff>
--- a/docs/committee-guide.docx
+++ b/docs/committee-guide.docx
@@ -2926,7 +2926,7 @@
           <w:sz w:val="30"/>
           <w:szCs w:val="30"/>
         </w:rPr>
-        <w:t xml:space="preserve">6. Views — Card view and Spreadsheet view</w:t>
+        <w:t xml:space="preserve">6. The spreadsheet view</w:t>
       </w:r>
     </w:p>
     <w:p>
@@ -2935,238 +2935,13 @@
       </w:pPr>
       <w:r>
         <w:rPr>
-          <w:b/>
-          <w:bCs/>
-          <w:sz w:val="22"/>
-          <w:szCs w:val="22"/>
-        </w:rPr>
-        <w:t xml:space="preserve">Card view: </w:t>
-      </w:r>
-      <w:r>
-        <w:rPr>
-          <w:sz w:val="22"/>
-          <w:szCs w:val="22"/>
-        </w:rPr>
-        <w:t xml:space="preserve">Each submission shown as a detailed card. Best for reviewing individual submissions in depth.</w:t>
-      </w:r>
-    </w:p>
-    <w:p>
-      <w:pPr>
-        <w:spacing w:after="60" w:before="60"/>
-      </w:pPr>
-      <w:r>
-        <w:rPr>
-          <w:b/>
-          <w:bCs/>
-          <w:sz w:val="22"/>
-          <w:szCs w:val="22"/>
-        </w:rPr>
-        <w:t xml:space="preserve">Spreadsheet view: </w:t>
-      </w:r>
-      <w:r>
-        <w:rPr>
-          <w:sz w:val="22"/>
-          <w:szCs w:val="22"/>
-        </w:rPr>
-        <w:t xml:space="preserve">Compact table, one row per submission. Click any row to open a side panel with full detail. Best for getting an overview quickly.</w:t>
-      </w:r>
-    </w:p>
-    <w:p>
-      <w:pPr>
-        <w:spacing w:after="60" w:before="60"/>
-      </w:pPr>
-      <w:r>
-        <w:rPr>
           <w:color w:val="222222"/>
           <w:sz w:val="22"/>
           <w:szCs w:val="22"/>
         </w:rPr>
-        <w:t xml:space="preserve">Toggle between views using the buttons in the top right. Your preference is saved automatically.</w:t>
-      </w:r>
-    </w:p>
-    <w:p>
-      <w:pPr>
-        <w:pStyle w:val="Heading2"/>
-        <w:spacing w:after="120" w:before="360"/>
-      </w:pPr>
-      <w:r>
-        <w:rPr>
-          <w:b/>
-          <w:bCs/>
-          <w:color w:val="1a3a5c"/>
-          <w:sz w:val="30"/>
-          <w:szCs w:val="30"/>
-        </w:rPr>
-        <w:t xml:space="preserve">7. Filters and search</w:t>
-      </w:r>
-    </w:p>
-    <w:p>
-      <w:pPr>
-        <w:pStyle w:val="ListParagraph"/>
-        <w:numPr>
-          <w:ilvl w:val="0"/>
-          <w:numId w:val="1"/>
-        </w:numPr>
-        <w:spacing w:after="40" w:before="40"/>
-      </w:pPr>
-      <w:r>
-        <w:rPr>
-          <w:sz w:val="22"/>
-          <w:szCs w:val="22"/>
-        </w:rPr>
-        <w:t xml:space="preserve">Search: filter by description, benefit, AI summary, or member name</w:t>
-      </w:r>
-    </w:p>
-    <w:p>
-      <w:pPr>
-        <w:pStyle w:val="ListParagraph"/>
-        <w:numPr>
-          <w:ilvl w:val="0"/>
-          <w:numId w:val="1"/>
-        </w:numPr>
-        <w:spacing w:after="40" w:before="40"/>
-      </w:pPr>
-      <w:r>
-        <w:rPr>
-          <w:sz w:val="22"/>
-          <w:szCs w:val="22"/>
-        </w:rPr>
-        <w:t xml:space="preserve">Status filter: click any status chip in the summary bar</w:t>
-      </w:r>
-    </w:p>
-    <w:p>
-      <w:pPr>
-        <w:pStyle w:val="ListParagraph"/>
-        <w:numPr>
-          <w:ilvl w:val="0"/>
-          <w:numId w:val="1"/>
-        </w:numPr>
-        <w:spacing w:after="40" w:before="40"/>
-      </w:pPr>
-      <w:r>
-        <w:rPr>
-          <w:sz w:val="22"/>
-          <w:szCs w:val="22"/>
-        </w:rPr>
-        <w:t xml:space="preserve">Flag filter: filter by Quick wins, H&amp;S, Revenue, Recurring, In Plan, or High cost</w:t>
-      </w:r>
-    </w:p>
-    <w:p>
-      <w:pPr>
-        <w:pStyle w:val="ListParagraph"/>
-        <w:numPr>
-          <w:ilvl w:val="0"/>
-          <w:numId w:val="1"/>
-        </w:numPr>
-        <w:spacing w:after="40" w:before="40"/>
-      </w:pPr>
-      <w:r>
-        <w:rPr>
-          <w:sz w:val="22"/>
-          <w:szCs w:val="22"/>
-        </w:rPr>
-        <w:t xml:space="preserve">Owner filter: show only submissions assigned to a particular director role</w:t>
-      </w:r>
-    </w:p>
-    <w:p>
-      <w:pPr>
-        <w:pStyle w:val="ListParagraph"/>
-        <w:numPr>
-          <w:ilvl w:val="0"/>
-          <w:numId w:val="1"/>
-        </w:numPr>
-        <w:spacing w:after="40" w:before="40"/>
-      </w:pPr>
-      <w:r>
-        <w:rPr>
-          <w:sz w:val="22"/>
-          <w:szCs w:val="22"/>
-        </w:rPr>
-        <w:t xml:space="preserve">Category filter: available to Club Manager / Super Admin who see all categories</w:t>
-      </w:r>
-    </w:p>
-    <w:p>
-      <w:pPr>
-        <w:pStyle w:val="ListParagraph"/>
-        <w:numPr>
-          <w:ilvl w:val="0"/>
-          <w:numId w:val="1"/>
-        </w:numPr>
-        <w:spacing w:after="40" w:before="40"/>
-      </w:pPr>
-      <w:r>
-        <w:rPr>
-          <w:sz w:val="22"/>
-          <w:szCs w:val="22"/>
-        </w:rPr>
-        <w:t xml:space="preserve">Show withdrawn: withdrawn submissions are hidden by default — tick to include them</w:t>
-      </w:r>
-    </w:p>
-    <w:p>
-      <w:pPr>
-        <w:pStyle w:val="Heading2"/>
-        <w:spacing w:after="120" w:before="360"/>
-      </w:pPr>
-      <w:r>
-        <w:rPr>
-          <w:b/>
-          <w:bCs/>
-          <w:color w:val="1a3a5c"/>
-          <w:sz w:val="30"/>
-          <w:szCs w:val="30"/>
-        </w:rPr>
-        <w:t xml:space="preserve">8. Managing submissions</w:t>
-      </w:r>
-    </w:p>
-    <w:tbl>
-      <w:tblPr>
-        <w:tblW w:type="pct" w:w="100%"/>
-        <w:tblBorders>
-          <w:top w:val="none"/>
-          <w:left w:val="none"/>
-          <w:bottom w:val="none"/>
-          <w:right w:val="none"/>
-          <w:insideH w:val="single" w:color="auto" w:sz="4"/>
-          <w:insideV w:val="single" w:color="auto" w:sz="4"/>
-        </w:tblBorders>
-        <w:tblCellMar>
-          <w:top w:type="dxa" w:w="160"/>
-          <w:bottom w:type="dxa" w:w="160"/>
-        </w:tblCellMar>
-      </w:tblPr>
-      <w:tblGrid>
-        <w:gridCol w:w="100"/>
-      </w:tblGrid>
-      <w:tr>
-        <w:tc>
-          <w:tcPr>
-            <w:tcBorders>
-              <w:top w:val="none"/>
-              <w:left w:val="single" w:color="1a3a5c" w:sz="16"/>
-              <w:bottom w:val="none"/>
-              <w:right w:val="none"/>
-            </w:tcBorders>
-            <w:shd w:fill="e8f0f8" w:val="clear"/>
-            <w:tcMar>
-              <w:top w:type="dxa" w:w="80"/>
-              <w:left w:type="dxa" w:w="160"/>
-              <w:bottom w:type="dxa" w:w="80"/>
-              <w:right w:type="dxa" w:w="160"/>
-            </w:tcMar>
-          </w:tcPr>
-          <w:p>
-            <w:r>
-              <w:rPr>
-                <w:color w:val="333333"/>
-                <w:sz w:val="20"/>
-                <w:szCs w:val="20"/>
-              </w:rPr>
-              <w:t xml:space="preserve">Only the Club Manager and Super Admin can perform the actions in this section.</w:t>
-            </w:r>
-          </w:p>
-        </w:tc>
-      </w:tr>
-    </w:tbl>
+        <w:t xml:space="preserve">The triage report uses a compact spreadsheet layout — one row per submission. Click any row to open a side panel with full detail and all management actions.</w:t>
+      </w:r>
+    </w:p>
     <w:p>
       <w:pPr>
         <w:pStyle w:val="Heading3"/>
@@ -3180,7 +2955,7 @@
           <w:sz w:val="24"/>
           <w:szCs w:val="24"/>
         </w:rPr>
-        <w:t xml:space="preserve">Changing status</w:t>
+        <w:t xml:space="preserve">Column order</w:t>
       </w:r>
     </w:p>
     <w:tbl>
@@ -3226,6 +3001,655 @@
                 <w:sz w:val="20"/>
                 <w:szCs w:val="20"/>
               </w:rPr>
+              <w:t xml:space="preserve">Column</w:t>
+            </w:r>
+          </w:p>
+        </w:tc>
+        <w:tc>
+          <w:tcPr>
+            <w:shd w:fill="1a3a5c" w:val="clear"/>
+            <w:tcMar>
+              <w:top w:type="dxa" w:w="80"/>
+              <w:left w:type="dxa" w:w="120"/>
+              <w:bottom w:type="dxa" w:w="80"/>
+              <w:right w:type="dxa" w:w="120"/>
+            </w:tcMar>
+          </w:tcPr>
+          <w:p>
+            <w:r>
+              <w:rPr>
+                <w:b/>
+                <w:bCs/>
+                <w:color w:val="FFFFFF"/>
+                <w:sz w:val="20"/>
+                <w:szCs w:val="20"/>
+              </w:rPr>
+              <w:t xml:space="preserve">What it shows</w:t>
+            </w:r>
+          </w:p>
+        </w:tc>
+      </w:tr>
+      <w:tr>
+        <w:tc>
+          <w:tcPr>
+            <w:shd w:fill="FFFFFF" w:val="clear"/>
+            <w:tcMar>
+              <w:top w:type="dxa" w:w="60"/>
+              <w:left w:type="dxa" w:w="120"/>
+              <w:bottom w:type="dxa" w:w="60"/>
+              <w:right w:type="dxa" w:w="120"/>
+            </w:tcMar>
+          </w:tcPr>
+          <w:p>
+            <w:r>
+              <w:rPr>
+                <w:sz w:val="20"/>
+                <w:szCs w:val="20"/>
+              </w:rPr>
+              <w:t xml:space="preserve">Score</w:t>
+            </w:r>
+          </w:p>
+        </w:tc>
+        <w:tc>
+          <w:tcPr>
+            <w:shd w:fill="FFFFFF" w:val="clear"/>
+            <w:tcMar>
+              <w:top w:type="dxa" w:w="60"/>
+              <w:left w:type="dxa" w:w="120"/>
+              <w:bottom w:type="dxa" w:w="60"/>
+              <w:right w:type="dxa" w:w="120"/>
+            </w:tcMar>
+          </w:tcPr>
+          <w:p>
+            <w:r>
+              <w:rPr>
+                <w:sz w:val="20"/>
+                <w:szCs w:val="20"/>
+              </w:rPr>
+              <w:t xml:space="preserve">AI score (or override score) with colour-coded band</w:t>
+            </w:r>
+          </w:p>
+        </w:tc>
+      </w:tr>
+      <w:tr>
+        <w:tc>
+          <w:tcPr>
+            <w:shd w:fill="f5f7fa" w:val="clear"/>
+            <w:tcMar>
+              <w:top w:type="dxa" w:w="60"/>
+              <w:left w:type="dxa" w:w="120"/>
+              <w:bottom w:type="dxa" w:w="60"/>
+              <w:right w:type="dxa" w:w="120"/>
+            </w:tcMar>
+          </w:tcPr>
+          <w:p>
+            <w:r>
+              <w:rPr>
+                <w:sz w:val="20"/>
+                <w:szCs w:val="20"/>
+              </w:rPr>
+              <w:t xml:space="preserve">Improvement</w:t>
+            </w:r>
+          </w:p>
+        </w:tc>
+        <w:tc>
+          <w:tcPr>
+            <w:shd w:fill="f5f7fa" w:val="clear"/>
+            <w:tcMar>
+              <w:top w:type="dxa" w:w="60"/>
+              <w:left w:type="dxa" w:w="120"/>
+              <w:bottom w:type="dxa" w:w="60"/>
+              <w:right w:type="dxa" w:w="120"/>
+            </w:tcMar>
+          </w:tcPr>
+          <w:p>
+            <w:r>
+              <w:rPr>
+                <w:sz w:val="20"/>
+                <w:szCs w:val="20"/>
+              </w:rPr>
+              <w:t xml:space="preserve">AI summary or original description</w:t>
+            </w:r>
+          </w:p>
+        </w:tc>
+      </w:tr>
+      <w:tr>
+        <w:tc>
+          <w:tcPr>
+            <w:shd w:fill="FFFFFF" w:val="clear"/>
+            <w:tcMar>
+              <w:top w:type="dxa" w:w="60"/>
+              <w:left w:type="dxa" w:w="120"/>
+              <w:bottom w:type="dxa" w:w="60"/>
+              <w:right w:type="dxa" w:w="120"/>
+            </w:tcMar>
+          </w:tcPr>
+          <w:p>
+            <w:r>
+              <w:rPr>
+                <w:sz w:val="20"/>
+                <w:szCs w:val="20"/>
+              </w:rPr>
+              <w:t xml:space="preserve">Area</w:t>
+            </w:r>
+          </w:p>
+        </w:tc>
+        <w:tc>
+          <w:tcPr>
+            <w:shd w:fill="FFFFFF" w:val="clear"/>
+            <w:tcMar>
+              <w:top w:type="dxa" w:w="60"/>
+              <w:left w:type="dxa" w:w="120"/>
+              <w:bottom w:type="dxa" w:w="60"/>
+              <w:right w:type="dxa" w:w="120"/>
+            </w:tcMar>
+          </w:tcPr>
+          <w:p>
+            <w:r>
+              <w:rPr>
+                <w:sz w:val="20"/>
+                <w:szCs w:val="20"/>
+              </w:rPr>
+              <w:t xml:space="preserve">Category the submission belongs to</w:t>
+            </w:r>
+          </w:p>
+        </w:tc>
+      </w:tr>
+      <w:tr>
+        <w:tc>
+          <w:tcPr>
+            <w:shd w:fill="f5f7fa" w:val="clear"/>
+            <w:tcMar>
+              <w:top w:type="dxa" w:w="60"/>
+              <w:left w:type="dxa" w:w="120"/>
+              <w:bottom w:type="dxa" w:w="60"/>
+              <w:right w:type="dxa" w:w="120"/>
+            </w:tcMar>
+          </w:tcPr>
+          <w:p>
+            <w:r>
+              <w:rPr>
+                <w:sz w:val="20"/>
+                <w:szCs w:val="20"/>
+              </w:rPr>
+              <w:t xml:space="preserve">Impl</w:t>
+            </w:r>
+          </w:p>
+        </w:tc>
+        <w:tc>
+          <w:tcPr>
+            <w:shd w:fill="f5f7fa" w:val="clear"/>
+            <w:tcMar>
+              <w:top w:type="dxa" w:w="60"/>
+              <w:left w:type="dxa" w:w="120"/>
+              <w:bottom w:type="dxa" w:w="60"/>
+              <w:right w:type="dxa" w:w="120"/>
+            </w:tcMar>
+          </w:tcPr>
+          <w:p>
+            <w:r>
+              <w:rPr>
+                <w:sz w:val="20"/>
+                <w:szCs w:val="20"/>
+              </w:rPr>
+              <w:t xml:space="preserve">Implementation complexity: quick win, project, or programme</w:t>
+            </w:r>
+          </w:p>
+        </w:tc>
+      </w:tr>
+      <w:tr>
+        <w:tc>
+          <w:tcPr>
+            <w:shd w:fill="FFFFFF" w:val="clear"/>
+            <w:tcMar>
+              <w:top w:type="dxa" w:w="60"/>
+              <w:left w:type="dxa" w:w="120"/>
+              <w:bottom w:type="dxa" w:w="60"/>
+              <w:right w:type="dxa" w:w="120"/>
+            </w:tcMar>
+          </w:tcPr>
+          <w:p>
+            <w:r>
+              <w:rPr>
+                <w:sz w:val="20"/>
+                <w:szCs w:val="20"/>
+              </w:rPr>
+              <w:t xml:space="preserve">Cost</w:t>
+            </w:r>
+          </w:p>
+        </w:tc>
+        <w:tc>
+          <w:tcPr>
+            <w:shd w:fill="FFFFFF" w:val="clear"/>
+            <w:tcMar>
+              <w:top w:type="dxa" w:w="60"/>
+              <w:left w:type="dxa" w:w="120"/>
+              <w:bottom w:type="dxa" w:w="60"/>
+              <w:right w:type="dxa" w:w="120"/>
+            </w:tcMar>
+          </w:tcPr>
+          <w:p>
+            <w:r>
+              <w:rPr>
+                <w:sz w:val="20"/>
+                <w:szCs w:val="20"/>
+              </w:rPr>
+              <w:t xml:space="preserve">🎯 confirmed cost target · ❓ AI estimated range</w:t>
+            </w:r>
+          </w:p>
+        </w:tc>
+      </w:tr>
+      <w:tr>
+        <w:tc>
+          <w:tcPr>
+            <w:shd w:fill="f5f7fa" w:val="clear"/>
+            <w:tcMar>
+              <w:top w:type="dxa" w:w="60"/>
+              <w:left w:type="dxa" w:w="120"/>
+              <w:bottom w:type="dxa" w:w="60"/>
+              <w:right w:type="dxa" w:w="120"/>
+            </w:tcMar>
+          </w:tcPr>
+          <w:p>
+            <w:r>
+              <w:rPr>
+                <w:sz w:val="20"/>
+                <w:szCs w:val="20"/>
+              </w:rPr>
+              <w:t xml:space="preserve">Date</w:t>
+            </w:r>
+          </w:p>
+        </w:tc>
+        <w:tc>
+          <w:tcPr>
+            <w:shd w:fill="f5f7fa" w:val="clear"/>
+            <w:tcMar>
+              <w:top w:type="dxa" w:w="60"/>
+              <w:left w:type="dxa" w:w="120"/>
+              <w:bottom w:type="dxa" w:w="60"/>
+              <w:right w:type="dxa" w:w="120"/>
+            </w:tcMar>
+          </w:tcPr>
+          <w:p>
+            <w:r>
+              <w:rPr>
+                <w:sz w:val="20"/>
+                <w:szCs w:val="20"/>
+              </w:rPr>
+              <w:t xml:space="preserve">🎯 confirmed target date · ❓ AI estimated date · submitted date if neither</w:t>
+            </w:r>
+          </w:p>
+        </w:tc>
+      </w:tr>
+      <w:tr>
+        <w:tc>
+          <w:tcPr>
+            <w:shd w:fill="FFFFFF" w:val="clear"/>
+            <w:tcMar>
+              <w:top w:type="dxa" w:w="60"/>
+              <w:left w:type="dxa" w:w="120"/>
+              <w:bottom w:type="dxa" w:w="60"/>
+              <w:right w:type="dxa" w:w="120"/>
+            </w:tcMar>
+          </w:tcPr>
+          <w:p>
+            <w:r>
+              <w:rPr>
+                <w:sz w:val="20"/>
+                <w:szCs w:val="20"/>
+              </w:rPr>
+              <w:t xml:space="preserve">Decision</w:t>
+            </w:r>
+          </w:p>
+        </w:tc>
+        <w:tc>
+          <w:tcPr>
+            <w:shd w:fill="FFFFFF" w:val="clear"/>
+            <w:tcMar>
+              <w:top w:type="dxa" w:w="60"/>
+              <w:left w:type="dxa" w:w="120"/>
+              <w:bottom w:type="dxa" w:w="60"/>
+              <w:right w:type="dxa" w:w="120"/>
+            </w:tcMar>
+          </w:tcPr>
+          <w:p>
+            <w:r>
+              <w:rPr>
+                <w:sz w:val="20"/>
+                <w:szCs w:val="20"/>
+              </w:rPr>
+              <w:t xml:space="preserve">Current status — dropdown for Club Manager</w:t>
+            </w:r>
+          </w:p>
+        </w:tc>
+      </w:tr>
+      <w:tr>
+        <w:tc>
+          <w:tcPr>
+            <w:shd w:fill="f5f7fa" w:val="clear"/>
+            <w:tcMar>
+              <w:top w:type="dxa" w:w="60"/>
+              <w:left w:type="dxa" w:w="120"/>
+              <w:bottom w:type="dxa" w:w="60"/>
+              <w:right w:type="dxa" w:w="120"/>
+            </w:tcMar>
+          </w:tcPr>
+          <w:p>
+            <w:r>
+              <w:rPr>
+                <w:sz w:val="20"/>
+                <w:szCs w:val="20"/>
+              </w:rPr>
+              <w:t xml:space="preserve">Owner</w:t>
+            </w:r>
+          </w:p>
+        </w:tc>
+        <w:tc>
+          <w:tcPr>
+            <w:shd w:fill="f5f7fa" w:val="clear"/>
+            <w:tcMar>
+              <w:top w:type="dxa" w:w="60"/>
+              <w:left w:type="dxa" w:w="120"/>
+              <w:bottom w:type="dxa" w:w="60"/>
+              <w:right w:type="dxa" w:w="120"/>
+            </w:tcMar>
+          </w:tcPr>
+          <w:p>
+            <w:r>
+              <w:rPr>
+                <w:sz w:val="20"/>
+                <w:szCs w:val="20"/>
+              </w:rPr>
+              <w:t xml:space="preserve">Assigned owner role — dropdown for Club Manager</w:t>
+            </w:r>
+          </w:p>
+        </w:tc>
+      </w:tr>
+      <w:tr>
+        <w:tc>
+          <w:tcPr>
+            <w:shd w:fill="FFFFFF" w:val="clear"/>
+            <w:tcMar>
+              <w:top w:type="dxa" w:w="60"/>
+              <w:left w:type="dxa" w:w="120"/>
+              <w:bottom w:type="dxa" w:w="60"/>
+              <w:right w:type="dxa" w:w="120"/>
+            </w:tcMar>
+          </w:tcPr>
+          <w:p>
+            <w:r>
+              <w:rPr>
+                <w:sz w:val="20"/>
+                <w:szCs w:val="20"/>
+              </w:rPr>
+              <w:t xml:space="preserve">Flags</w:t>
+            </w:r>
+          </w:p>
+        </w:tc>
+        <w:tc>
+          <w:tcPr>
+            <w:shd w:fill="FFFFFF" w:val="clear"/>
+            <w:tcMar>
+              <w:top w:type="dxa" w:w="60"/>
+              <w:left w:type="dxa" w:w="120"/>
+              <w:bottom w:type="dxa" w:w="60"/>
+              <w:right w:type="dxa" w:w="120"/>
+            </w:tcMar>
+          </w:tcPr>
+          <w:p>
+            <w:r>
+              <w:rPr>
+                <w:sz w:val="20"/>
+                <w:szCs w:val="20"/>
+              </w:rPr>
+              <w:t xml:space="preserve">Icon flags: ⚠ H&amp;S, ⚡ Quick win, 💰 Revenue, 🔁 Recurring, etc.</w:t>
+            </w:r>
+          </w:p>
+        </w:tc>
+      </w:tr>
+    </w:tbl>
+    <w:p>
+      <w:pPr>
+        <w:pStyle w:val="Heading2"/>
+        <w:spacing w:after="120" w:before="360"/>
+      </w:pPr>
+      <w:r>
+        <w:rPr>
+          <w:b/>
+          <w:bCs/>
+          <w:color w:val="1a3a5c"/>
+          <w:sz w:val="30"/>
+          <w:szCs w:val="30"/>
+        </w:rPr>
+        <w:t xml:space="preserve">7. Filters and search</w:t>
+      </w:r>
+    </w:p>
+    <w:p>
+      <w:pPr>
+        <w:pStyle w:val="ListParagraph"/>
+        <w:numPr>
+          <w:ilvl w:val="0"/>
+          <w:numId w:val="1"/>
+        </w:numPr>
+        <w:spacing w:after="40" w:before="40"/>
+      </w:pPr>
+      <w:r>
+        <w:rPr>
+          <w:sz w:val="22"/>
+          <w:szCs w:val="22"/>
+        </w:rPr>
+        <w:t xml:space="preserve">Search: filter by description, benefit, AI summary, or member name</w:t>
+      </w:r>
+    </w:p>
+    <w:p>
+      <w:pPr>
+        <w:pStyle w:val="ListParagraph"/>
+        <w:numPr>
+          <w:ilvl w:val="0"/>
+          <w:numId w:val="1"/>
+        </w:numPr>
+        <w:spacing w:after="40" w:before="40"/>
+      </w:pPr>
+      <w:r>
+        <w:rPr>
+          <w:sz w:val="22"/>
+          <w:szCs w:val="22"/>
+        </w:rPr>
+        <w:t xml:space="preserve">Status filter: click any status chip in the summary bar</w:t>
+      </w:r>
+    </w:p>
+    <w:p>
+      <w:pPr>
+        <w:pStyle w:val="ListParagraph"/>
+        <w:numPr>
+          <w:ilvl w:val="0"/>
+          <w:numId w:val="1"/>
+        </w:numPr>
+        <w:spacing w:after="40" w:before="40"/>
+      </w:pPr>
+      <w:r>
+        <w:rPr>
+          <w:sz w:val="22"/>
+          <w:szCs w:val="22"/>
+        </w:rPr>
+        <w:t xml:space="preserve">Flag filter: filter by Quick wins, H&amp;S, Revenue, Recurring, In Plan, or High cost</w:t>
+      </w:r>
+    </w:p>
+    <w:p>
+      <w:pPr>
+        <w:pStyle w:val="ListParagraph"/>
+        <w:numPr>
+          <w:ilvl w:val="0"/>
+          <w:numId w:val="1"/>
+        </w:numPr>
+        <w:spacing w:after="40" w:before="40"/>
+      </w:pPr>
+      <w:r>
+        <w:rPr>
+          <w:sz w:val="22"/>
+          <w:szCs w:val="22"/>
+        </w:rPr>
+        <w:t xml:space="preserve">Owner filter: show only submissions assigned to a particular director role</w:t>
+      </w:r>
+    </w:p>
+    <w:p>
+      <w:pPr>
+        <w:pStyle w:val="ListParagraph"/>
+        <w:numPr>
+          <w:ilvl w:val="0"/>
+          <w:numId w:val="1"/>
+        </w:numPr>
+        <w:spacing w:after="40" w:before="40"/>
+      </w:pPr>
+      <w:r>
+        <w:rPr>
+          <w:sz w:val="22"/>
+          <w:szCs w:val="22"/>
+        </w:rPr>
+        <w:t xml:space="preserve">Category filter: available to Club Manager / Super Admin who see all categories</w:t>
+      </w:r>
+    </w:p>
+    <w:p>
+      <w:pPr>
+        <w:pStyle w:val="ListParagraph"/>
+        <w:numPr>
+          <w:ilvl w:val="0"/>
+          <w:numId w:val="1"/>
+        </w:numPr>
+        <w:spacing w:after="40" w:before="40"/>
+      </w:pPr>
+      <w:r>
+        <w:rPr>
+          <w:sz w:val="22"/>
+          <w:szCs w:val="22"/>
+        </w:rPr>
+        <w:t xml:space="preserve">Show withdrawn: withdrawn submissions are hidden by default — tick to include them</w:t>
+      </w:r>
+    </w:p>
+    <w:p>
+      <w:pPr>
+        <w:pStyle w:val="Heading2"/>
+        <w:spacing w:after="120" w:before="360"/>
+      </w:pPr>
+      <w:r>
+        <w:rPr>
+          <w:b/>
+          <w:bCs/>
+          <w:color w:val="1a3a5c"/>
+          <w:sz w:val="30"/>
+          <w:szCs w:val="30"/>
+        </w:rPr>
+        <w:t xml:space="preserve">8. Managing submissions</w:t>
+      </w:r>
+    </w:p>
+    <w:tbl>
+      <w:tblPr>
+        <w:tblW w:type="pct" w:w="100%"/>
+        <w:tblBorders>
+          <w:top w:val="none"/>
+          <w:left w:val="none"/>
+          <w:bottom w:val="none"/>
+          <w:right w:val="none"/>
+          <w:insideH w:val="single" w:color="auto" w:sz="4"/>
+          <w:insideV w:val="single" w:color="auto" w:sz="4"/>
+        </w:tblBorders>
+        <w:tblCellMar>
+          <w:top w:type="dxa" w:w="160"/>
+          <w:bottom w:type="dxa" w:w="160"/>
+        </w:tblCellMar>
+      </w:tblPr>
+      <w:tblGrid>
+        <w:gridCol w:w="100"/>
+      </w:tblGrid>
+      <w:tr>
+        <w:tc>
+          <w:tcPr>
+            <w:tcBorders>
+              <w:top w:val="none"/>
+              <w:left w:val="single" w:color="1a3a5c" w:sz="16"/>
+              <w:bottom w:val="none"/>
+              <w:right w:val="none"/>
+            </w:tcBorders>
+            <w:shd w:fill="e8f0f8" w:val="clear"/>
+            <w:tcMar>
+              <w:top w:type="dxa" w:w="80"/>
+              <w:left w:type="dxa" w:w="160"/>
+              <w:bottom w:type="dxa" w:w="80"/>
+              <w:right w:type="dxa" w:w="160"/>
+            </w:tcMar>
+          </w:tcPr>
+          <w:p>
+            <w:r>
+              <w:rPr>
+                <w:color w:val="333333"/>
+                <w:sz w:val="20"/>
+                <w:szCs w:val="20"/>
+              </w:rPr>
+              <w:t xml:space="preserve">Only the Club Manager and Super Admin can perform the actions in this section.</w:t>
+            </w:r>
+          </w:p>
+        </w:tc>
+      </w:tr>
+    </w:tbl>
+    <w:p>
+      <w:pPr>
+        <w:pStyle w:val="Heading3"/>
+        <w:spacing w:after="80" w:before="280"/>
+      </w:pPr>
+      <w:r>
+        <w:rPr>
+          <w:b/>
+          <w:bCs/>
+          <w:color w:val="1a3a5c"/>
+          <w:sz w:val="24"/>
+          <w:szCs w:val="24"/>
+        </w:rPr>
+        <w:t xml:space="preserve">Changing status</w:t>
+      </w:r>
+    </w:p>
+    <w:tbl>
+      <w:tblPr>
+        <w:tblW w:type="pct" w:w="100%"/>
+        <w:tblBorders>
+          <w:top w:val="single" w:color="auto" w:sz="4"/>
+          <w:left w:val="single" w:color="auto" w:sz="4"/>
+          <w:bottom w:val="single" w:color="auto" w:sz="4"/>
+          <w:right w:val="single" w:color="auto" w:sz="4"/>
+          <w:insideH w:val="single" w:color="auto" w:sz="4"/>
+          <w:insideV w:val="single" w:color="auto" w:sz="4"/>
+        </w:tblBorders>
+        <w:tblCellMar>
+          <w:top w:type="dxa" w:w="160"/>
+          <w:bottom w:type="dxa" w:w="160"/>
+        </w:tblCellMar>
+      </w:tblPr>
+      <w:tblGrid>
+        <w:gridCol w:w="100"/>
+        <w:gridCol w:w="100"/>
+      </w:tblGrid>
+      <w:tr>
+        <w:trPr>
+          <w:tblHeader/>
+        </w:trPr>
+        <w:tc>
+          <w:tcPr>
+            <w:shd w:fill="1a3a5c" w:val="clear"/>
+            <w:tcMar>
+              <w:top w:type="dxa" w:w="80"/>
+              <w:left w:type="dxa" w:w="120"/>
+              <w:bottom w:type="dxa" w:w="80"/>
+              <w:right w:type="dxa" w:w="120"/>
+            </w:tcMar>
+          </w:tcPr>
+          <w:p>
+            <w:r>
+              <w:rPr>
+                <w:b/>
+                <w:bCs/>
+                <w:color w:val="FFFFFF"/>
+                <w:sz w:val="20"/>
+                <w:szCs w:val="20"/>
+              </w:rPr>
               <w:t xml:space="preserve">Status</w:t>
             </w:r>
           </w:p>
@@ -3581,7 +4005,7 @@
                 <w:sz w:val="20"/>
                 <w:szCs w:val="20"/>
               </w:rPr>
-              <w:t xml:space="preserve">When you change status to Under Consideration, Approved, or In Plan, you will be prompted to enter a target date. The AI's suggested date is pre-filled for convenience.</w:t>
+              <w:t xml:space="preserve">Target date and cost target can be set independently at any time from the Committee Decision section of the side panel — they do not require a status change.</w:t>
             </w:r>
           </w:p>
         </w:tc>
@@ -3707,28 +4131,23 @@
           <w:sz w:val="30"/>
           <w:szCs w:val="30"/>
         </w:rPr>
-        <w:t xml:space="preserve">9. Target dates</w:t>
-      </w:r>
-    </w:p>
-    <w:p>
-      <w:pPr>
-        <w:spacing w:after="60" w:before="60"/>
+        <w:t xml:space="preserve">9. Target dates and cost targets</w:t>
+      </w:r>
+    </w:p>
+    <w:p>
+      <w:pPr>
+        <w:pStyle w:val="Heading3"/>
+        <w:spacing w:after="80" w:before="280"/>
       </w:pPr>
       <w:r>
         <w:rPr>
           <w:b/>
           <w:bCs/>
-          <w:sz w:val="22"/>
-          <w:szCs w:val="22"/>
-        </w:rPr>
-        <w:t xml:space="preserve">AI suggested date: </w:t>
-      </w:r>
-      <w:r>
-        <w:rPr>
-          <w:sz w:val="22"/>
-          <w:szCs w:val="22"/>
-        </w:rPr>
-        <w:t xml:space="preserve">Calculated from the implementation time estimate; shown as a reference.</w:t>
+          <w:color w:val="1a3a5c"/>
+          <w:sz w:val="24"/>
+          <w:szCs w:val="24"/>
+        </w:rPr>
+        <w:t xml:space="preserve">Target date</w:t>
       </w:r>
     </w:p>
     <w:p>
@@ -3742,16 +4161,170 @@
           <w:sz w:val="22"/>
           <w:szCs w:val="22"/>
         </w:rPr>
-        <w:t xml:space="preserve">Confirmed target date: </w:t>
-      </w:r>
-      <w:r>
-        <w:rPr>
-          <w:sz w:val="22"/>
-          <w:szCs w:val="22"/>
-        </w:rPr>
-        <w:t xml:space="preserve">Set by the Club Manager when changing status, shown with a ✓ confirmed indicator. Visible to the member in their My Improvements page.</w:t>
-      </w:r>
-    </w:p>
+        <w:t xml:space="preserve">AI estimated date (❓): </w:t>
+      </w:r>
+      <w:r>
+        <w:rPr>
+          <w:sz w:val="22"/>
+          <w:szCs w:val="22"/>
+        </w:rPr>
+        <w:t xml:space="preserve">Calculated from the AI's implementation time estimate; shown as a reference in grey.</w:t>
+      </w:r>
+    </w:p>
+    <w:p>
+      <w:pPr>
+        <w:spacing w:after="60" w:before="60"/>
+      </w:pPr>
+      <w:r>
+        <w:rPr>
+          <w:b/>
+          <w:bCs/>
+          <w:sz w:val="22"/>
+          <w:szCs w:val="22"/>
+        </w:rPr>
+        <w:t xml:space="preserve">Confirmed target date (🎯): </w:t>
+      </w:r>
+      <w:r>
+        <w:rPr>
+          <w:sz w:val="22"/>
+          <w:szCs w:val="22"/>
+        </w:rPr>
+        <w:t xml:space="preserve">Set by the Club Manager in the Committee Decision panel. Shown in green with a ✓ confirmed indicator. Visible to the member in their My Improvements page.</w:t>
+      </w:r>
+    </w:p>
+    <w:p>
+      <w:pPr>
+        <w:spacing w:after="60" w:before="60"/>
+      </w:pPr>
+      <w:r>
+        <w:rPr>
+          <w:color w:val="222222"/>
+          <w:sz w:val="22"/>
+          <w:szCs w:val="22"/>
+        </w:rPr>
+        <w:t xml:space="preserve">Use the "Use AI estimate" shortcut to pre-fill the AI suggested date, then adjust if needed. The date can be cleared with the ✕ button.</w:t>
+      </w:r>
+    </w:p>
+    <w:p>
+      <w:pPr>
+        <w:pStyle w:val="Heading3"/>
+        <w:spacing w:after="80" w:before="280"/>
+      </w:pPr>
+      <w:r>
+        <w:rPr>
+          <w:b/>
+          <w:bCs/>
+          <w:color w:val="1a3a5c"/>
+          <w:sz w:val="24"/>
+          <w:szCs w:val="24"/>
+        </w:rPr>
+        <w:t xml:space="preserve">Cost target</w:t>
+      </w:r>
+    </w:p>
+    <w:p>
+      <w:pPr>
+        <w:spacing w:after="60" w:before="60"/>
+      </w:pPr>
+      <w:r>
+        <w:rPr>
+          <w:b/>
+          <w:bCs/>
+          <w:sz w:val="22"/>
+          <w:szCs w:val="22"/>
+        </w:rPr>
+        <w:t xml:space="preserve">AI estimated cost (❓): </w:t>
+      </w:r>
+      <w:r>
+        <w:rPr>
+          <w:sz w:val="22"/>
+          <w:szCs w:val="22"/>
+        </w:rPr>
+        <w:t xml:space="preserve">The AI provides a cost range based on typical costs for similar work. Shown in grey as a reference.</w:t>
+      </w:r>
+    </w:p>
+    <w:p>
+      <w:pPr>
+        <w:spacing w:after="60" w:before="60"/>
+      </w:pPr>
+      <w:r>
+        <w:rPr>
+          <w:b/>
+          <w:bCs/>
+          <w:sz w:val="22"/>
+          <w:szCs w:val="22"/>
+        </w:rPr>
+        <w:t xml:space="preserve">Confirmed cost target (🎯): </w:t>
+      </w:r>
+      <w:r>
+        <w:rPr>
+          <w:sz w:val="22"/>
+          <w:szCs w:val="22"/>
+        </w:rPr>
+        <w:t xml:space="preserve">Enter a specific budget figure (whole pounds) in the Cost target field in the Committee Decision panel. Replaces the AI estimate with a green 🎯 confirmed figure in the spreadsheet.</w:t>
+      </w:r>
+    </w:p>
+    <w:p>
+      <w:pPr>
+        <w:spacing w:after="60" w:before="60"/>
+      </w:pPr>
+      <w:r>
+        <w:rPr>
+          <w:color w:val="222222"/>
+          <w:sz w:val="22"/>
+          <w:szCs w:val="22"/>
+        </w:rPr>
+        <w:t xml:space="preserve">Use the "Use AI midpoint" shortcut to pre-fill the midpoint of the AI range as a starting point. The cost target can be cleared with the ✕ button.</w:t>
+      </w:r>
+    </w:p>
+    <w:tbl>
+      <w:tblPr>
+        <w:tblW w:type="pct" w:w="100%"/>
+        <w:tblBorders>
+          <w:top w:val="none"/>
+          <w:left w:val="none"/>
+          <w:bottom w:val="none"/>
+          <w:right w:val="none"/>
+          <w:insideH w:val="single" w:color="auto" w:sz="4"/>
+          <w:insideV w:val="single" w:color="auto" w:sz="4"/>
+        </w:tblBorders>
+        <w:tblCellMar>
+          <w:top w:type="dxa" w:w="160"/>
+          <w:bottom w:type="dxa" w:w="160"/>
+        </w:tblCellMar>
+      </w:tblPr>
+      <w:tblGrid>
+        <w:gridCol w:w="100"/>
+      </w:tblGrid>
+      <w:tr>
+        <w:tc>
+          <w:tcPr>
+            <w:tcBorders>
+              <w:top w:val="none"/>
+              <w:left w:val="single" w:color="1a3a5c" w:sz="16"/>
+              <w:bottom w:val="none"/>
+              <w:right w:val="none"/>
+            </w:tcBorders>
+            <w:shd w:fill="e8f0f8" w:val="clear"/>
+            <w:tcMar>
+              <w:top w:type="dxa" w:w="80"/>
+              <w:left w:type="dxa" w:w="160"/>
+              <w:bottom w:type="dxa" w:w="80"/>
+              <w:right w:type="dxa" w:w="160"/>
+            </w:tcMar>
+          </w:tcPr>
+          <w:p>
+            <w:r>
+              <w:rPr>
+                <w:color w:val="333333"/>
+                <w:sz w:val="20"/>
+                <w:szCs w:val="20"/>
+              </w:rPr>
+              <w:t xml:space="preserve">Cost target is a planning figure for the committee — it is not currently shown to members.</w:t>
+            </w:r>
+          </w:p>
+        </w:tc>
+      </w:tr>
+    </w:tbl>
     <w:p>
       <w:pPr>
         <w:pStyle w:val="Heading2"/>

</xml_diff>